<commit_message>
Fill IEEE paper with corrected results; add repo-root onboarding docs
IEEE_Paper_AI_Swing_Trading.docx: filled Table I (strategy comparison)
and Table II (RSI threshold ablation) with the real numbers from the
now-fixed paper_experiments.py backtest. AI Swing Trader row and all
of Table III (confidence sensitivity) stay as placeholders — both
depend on closed trades from the live swing-trade job, which has none
yet. Removed the now-resolved "[NOTE: replace placeholder values...]"
instruction from the Table I intro sentence.

Added the 6 markdown docs sitting untracked at the repo root
(COMPLETE_PROJECT_SUMMARY, DEPENDENCIES, INSTALLATION_SUMMARY,
MARKET_SCANNER_GUIDE, QUICKSTART, START_HERE). Checked first: these
aren't stray duplicates of the same-named files inside ai-stock-agent/
— they're distinct, intentionally-placed repo-root overview docs (they
reference paths like ai-stock-agent/requirements.txt, i.e. written to
be read from the repo root) that happened to never get committed.
</commit_message>
<xml_diff>
--- a/ai-stock-agent/paper_results/IEEE_Paper_AI_Swing_Trading.docx
+++ b/ai-stock-agent/paper_results/IEEE_Paper_AI_Swing_Trading.docx
@@ -495,7 +495,7 @@
           <w:i w:val="0"/>
           <w:sz w:val="20"/>
         </w:rPr>
-        <w:t>Table I summarises the performance of all four strategies over the 2024 test period. [NOTE: Replace placeholder values below with actual results from paper_experiments.py after running it.]</w:t>
+        <w:t>Table I summarises the performance of all four strategies over the 2024 test period.</w:t>
       </w:r>
     </w:p>
     <w:p>
@@ -873,7 +873,7 @@
                 <w:i w:val="0"/>
                 <w:sz w:val="18"/>
               </w:rPr>
-              <w:t>—</w:t>
+              <w:t>99</w:t>
             </w:r>
           </w:p>
         </w:tc>
@@ -892,7 +892,7 @@
                 <w:i w:val="0"/>
                 <w:sz w:val="18"/>
               </w:rPr>
-              <w:t>—%</w:t>
+              <w:t>59.6%</w:t>
             </w:r>
           </w:p>
         </w:tc>
@@ -911,7 +911,7 @@
                 <w:i w:val="0"/>
                 <w:sz w:val="18"/>
               </w:rPr>
-              <w:t>—%</w:t>
+              <w:t>+10.46%</w:t>
             </w:r>
           </w:p>
         </w:tc>
@@ -930,7 +930,7 @@
                 <w:i w:val="0"/>
                 <w:sz w:val="18"/>
               </w:rPr>
-              <w:t>—%</w:t>
+              <w:t>+10.46%</w:t>
             </w:r>
           </w:p>
         </w:tc>
@@ -949,7 +949,7 @@
                 <w:i w:val="0"/>
                 <w:sz w:val="18"/>
               </w:rPr>
-              <w:t>—</w:t>
+              <w:t>0.345</w:t>
             </w:r>
           </w:p>
         </w:tc>
@@ -968,7 +968,7 @@
                 <w:i w:val="0"/>
                 <w:sz w:val="18"/>
               </w:rPr>
-              <w:t>—%</w:t>
+              <w:t>-3.53%</w:t>
             </w:r>
           </w:p>
         </w:tc>
@@ -987,7 +987,7 @@
                 <w:i w:val="0"/>
                 <w:sz w:val="18"/>
               </w:rPr>
-              <w:t>—</w:t>
+              <w:t>1.80</w:t>
             </w:r>
           </w:p>
         </w:tc>
@@ -1046,7 +1046,7 @@
                 <w:i w:val="0"/>
                 <w:sz w:val="18"/>
               </w:rPr>
-              <w:t>—%</w:t>
+              <w:t>100%</w:t>
             </w:r>
           </w:p>
         </w:tc>
@@ -1065,7 +1065,7 @@
                 <w:i w:val="0"/>
                 <w:sz w:val="18"/>
               </w:rPr>
-              <w:t>—%</w:t>
+              <w:t>+25.59%</w:t>
             </w:r>
           </w:p>
         </w:tc>
@@ -1084,7 +1084,7 @@
                 <w:i w:val="0"/>
                 <w:sz w:val="18"/>
               </w:rPr>
-              <w:t>—%</w:t>
+              <w:t>+25.59%</w:t>
             </w:r>
           </w:p>
         </w:tc>
@@ -1103,7 +1103,7 @@
                 <w:i w:val="0"/>
                 <w:sz w:val="18"/>
               </w:rPr>
-              <w:t>—</w:t>
+              <w:t>1.88</w:t>
             </w:r>
           </w:p>
         </w:tc>
@@ -1122,7 +1122,7 @@
                 <w:i w:val="0"/>
                 <w:sz w:val="18"/>
               </w:rPr>
-              <w:t>—%</w:t>
+              <w:t>-8.41%</w:t>
             </w:r>
           </w:p>
         </w:tc>
@@ -1181,7 +1181,7 @@
                 <w:i w:val="0"/>
                 <w:sz w:val="18"/>
               </w:rPr>
-              <w:t>—</w:t>
+              <w:t>37</w:t>
             </w:r>
           </w:p>
         </w:tc>
@@ -1200,7 +1200,7 @@
                 <w:i w:val="0"/>
                 <w:sz w:val="18"/>
               </w:rPr>
-              <w:t>—%</w:t>
+              <w:t>54.3%</w:t>
             </w:r>
           </w:p>
         </w:tc>
@@ -1219,7 +1219,7 @@
                 <w:i w:val="0"/>
                 <w:sz w:val="18"/>
               </w:rPr>
-              <w:t>—%</w:t>
+              <w:t>+4.24%</w:t>
             </w:r>
           </w:p>
         </w:tc>
@@ -1238,7 +1238,7 @@
                 <w:i w:val="0"/>
                 <w:sz w:val="18"/>
               </w:rPr>
-              <w:t>—%</w:t>
+              <w:t>+4.24%</w:t>
             </w:r>
           </w:p>
         </w:tc>
@@ -1257,7 +1257,7 @@
                 <w:i w:val="0"/>
                 <w:sz w:val="18"/>
               </w:rPr>
-              <w:t>—</w:t>
+              <w:t>0.325</w:t>
             </w:r>
           </w:p>
         </w:tc>
@@ -1276,7 +1276,7 @@
                 <w:i w:val="0"/>
                 <w:sz w:val="18"/>
               </w:rPr>
-              <w:t>—%</w:t>
+              <w:t>-4.04%</w:t>
             </w:r>
           </w:p>
         </w:tc>
@@ -1528,7 +1528,7 @@
                 <w:i w:val="0"/>
                 <w:sz w:val="18"/>
               </w:rPr>
-              <w:t>—</w:t>
+              <w:t>189</w:t>
             </w:r>
           </w:p>
         </w:tc>
@@ -1547,7 +1547,7 @@
                 <w:i w:val="0"/>
                 <w:sz w:val="18"/>
               </w:rPr>
-              <w:t>—%</w:t>
+              <w:t>55.0%</w:t>
             </w:r>
           </w:p>
         </w:tc>
@@ -1566,7 +1566,7 @@
                 <w:i w:val="0"/>
                 <w:sz w:val="18"/>
               </w:rPr>
-              <w:t>—%</w:t>
+              <w:t>+15.53%</w:t>
             </w:r>
           </w:p>
         </w:tc>
@@ -1585,7 +1585,7 @@
                 <w:i w:val="0"/>
                 <w:sz w:val="18"/>
               </w:rPr>
-              <w:t>—</w:t>
+              <w:t>0.151</w:t>
             </w:r>
           </w:p>
         </w:tc>
@@ -1604,7 +1604,7 @@
                 <w:i w:val="0"/>
                 <w:sz w:val="18"/>
               </w:rPr>
-              <w:t>—%</w:t>
+              <w:t>-7.00%</w:t>
             </w:r>
           </w:p>
         </w:tc>
@@ -1644,7 +1644,7 @@
                 <w:i w:val="0"/>
                 <w:sz w:val="18"/>
               </w:rPr>
-              <w:t>—</w:t>
+              <w:t>166</w:t>
             </w:r>
           </w:p>
         </w:tc>
@@ -1663,7 +1663,7 @@
                 <w:i w:val="0"/>
                 <w:sz w:val="18"/>
               </w:rPr>
-              <w:t>—%</w:t>
+              <w:t>53.0%</w:t>
             </w:r>
           </w:p>
         </w:tc>
@@ -1682,7 +1682,7 @@
                 <w:i w:val="0"/>
                 <w:sz w:val="18"/>
               </w:rPr>
-              <w:t>—%</w:t>
+              <w:t>+14.26%</w:t>
             </w:r>
           </w:p>
         </w:tc>
@@ -1701,7 +1701,7 @@
                 <w:i w:val="0"/>
                 <w:sz w:val="18"/>
               </w:rPr>
-              <w:t>—</w:t>
+              <w:t>0.157</w:t>
             </w:r>
           </w:p>
         </w:tc>
@@ -1720,7 +1720,7 @@
                 <w:i w:val="0"/>
                 <w:sz w:val="18"/>
               </w:rPr>
-              <w:t>—%</w:t>
+              <w:t>-7.45%</w:t>
             </w:r>
           </w:p>
         </w:tc>
@@ -1760,7 +1760,7 @@
                 <w:i w:val="0"/>
                 <w:sz w:val="18"/>
               </w:rPr>
-              <w:t>—</w:t>
+              <w:t>130</w:t>
             </w:r>
           </w:p>
         </w:tc>
@@ -1779,7 +1779,7 @@
                 <w:i w:val="0"/>
                 <w:sz w:val="18"/>
               </w:rPr>
-              <w:t>—%</w:t>
+              <w:t>56.2%</w:t>
             </w:r>
           </w:p>
         </w:tc>
@@ -1798,7 +1798,7 @@
                 <w:i w:val="0"/>
                 <w:sz w:val="18"/>
               </w:rPr>
-              <w:t>—%</w:t>
+              <w:t>+15.26%</w:t>
             </w:r>
           </w:p>
         </w:tc>
@@ -1817,7 +1817,7 @@
                 <w:i w:val="0"/>
                 <w:sz w:val="18"/>
               </w:rPr>
-              <w:t>—</w:t>
+              <w:t>0.283</w:t>
             </w:r>
           </w:p>
         </w:tc>
@@ -1836,7 +1836,7 @@
                 <w:i w:val="0"/>
                 <w:sz w:val="18"/>
               </w:rPr>
-              <w:t>—%</w:t>
+              <w:t>-3.64%</w:t>
             </w:r>
           </w:p>
         </w:tc>
@@ -1876,7 +1876,7 @@
                 <w:i w:val="0"/>
                 <w:sz w:val="18"/>
               </w:rPr>
-              <w:t>—</w:t>
+              <w:t>84</w:t>
             </w:r>
           </w:p>
         </w:tc>
@@ -1895,7 +1895,7 @@
                 <w:i w:val="0"/>
                 <w:sz w:val="18"/>
               </w:rPr>
-              <w:t>—%</w:t>
+              <w:t>61.9%</w:t>
             </w:r>
           </w:p>
         </w:tc>
@@ -1914,7 +1914,7 @@
                 <w:i w:val="0"/>
                 <w:sz w:val="18"/>
               </w:rPr>
-              <w:t>—%</w:t>
+              <w:t>+17.30%</w:t>
             </w:r>
           </w:p>
         </w:tc>
@@ -1933,7 +1933,7 @@
                 <w:i w:val="0"/>
                 <w:sz w:val="18"/>
               </w:rPr>
-              <w:t>—</w:t>
+              <w:t>0.468</w:t>
             </w:r>
           </w:p>
         </w:tc>
@@ -1952,7 +1952,7 @@
                 <w:i w:val="0"/>
                 <w:sz w:val="18"/>
               </w:rPr>
-              <w:t>—%</w:t>
+              <w:t>-2.90%</w:t>
             </w:r>
           </w:p>
         </w:tc>

</xml_diff>